<commit_message>
Update Lista 2 - correção exercicios 1-5.docx
</commit_message>
<xml_diff>
--- a/Curso_Em_JAVA/Aula 5/exercicios/Lista 2 - correção exercicios 1-5.docx
+++ b/Curso_Em_JAVA/Aula 5/exercicios/Lista 2 - correção exercicios 1-5.docx
@@ -15,7 +15,35 @@
           <w:sz w:val="32"/>
           <w:szCs w:val="32"/>
         </w:rPr>
-        <w:t>Lista de Exercícios Aula 5 (Estrutura Condicionais)</w:t>
+        <w:t>Lista de Exercícios</w:t>
+      </w:r>
+      <w:r>
+        <w:rPr>
+          <w:sz w:val="32"/>
+          <w:szCs w:val="32"/>
+        </w:rPr>
+        <w:t xml:space="preserve"> 02</w:t>
+      </w:r>
+      <w:r>
+        <w:rPr>
+          <w:sz w:val="32"/>
+          <w:szCs w:val="32"/>
+        </w:rPr>
+        <w:t xml:space="preserve"> Aula 5 (</w:t>
+      </w:r>
+      <w:r>
+        <w:rPr>
+          <w:sz w:val="32"/>
+          <w:szCs w:val="32"/>
+        </w:rPr>
+        <w:t xml:space="preserve">1-5 </w:t>
+      </w:r>
+      <w:r>
+        <w:rPr>
+          <w:sz w:val="32"/>
+          <w:szCs w:val="32"/>
+        </w:rPr>
+        <w:t>Estrutura Condicionais)</w:t>
       </w:r>
     </w:p>
     <w:p>

</xml_diff>